<commit_message>
docs: connect Split_Strategy_Analysis to the materialised split + verified numbers
Add a "materialised split / where the data lives" section (data/splits, split_report,
load_checkpoint_split) with the verified figures: train 26,104 / test 6,489 (5,756
students), at-risk 0.530/0.520, 0 overlap, identical across all six checkpoints.

Co-Authored-By: Claude Opus 4.8 (1M context) <noreply@anthropic.com>
</commit_message>
<xml_diff>
--- a/docs/05_splitting/Split_Strategy_Analysis_EN.docx
+++ b/docs/05_splitting/Split_Strategy_Analysis_EN.docx
@@ -28,7 +28,7 @@
         </w:p>
       </w:sdtContent>
     </w:sdt>
-    <w:bookmarkStart w:id="15" w:name="Xdc3fb6495ff169f6f5e2d648ee721e9b1232940"/>
+    <w:bookmarkStart w:id="16" w:name="Xdc3fb6495ff169f6f5e2d648ee721e9b1232940"/>
     <w:p>
       <w:pPr>
         <w:pStyle w:val="Heading1"/>
@@ -778,7 +778,365 @@
       </w:r>
     </w:p>
     <w:bookmarkEnd w:id="13"/>
-    <w:bookmarkStart w:id="14" w:name="references"/>
+    <w:bookmarkStart w:id="14" w:name="Xe72ba7a14e3710ad4f35df53562c07365fcb8d0"/>
+    <w:p>
+      <w:pPr>
+        <w:pStyle w:val="Heading2"/>
+      </w:pPr>
+      <w:r>
+        <w:t xml:space="preserve">6. Materialised split and where the data lives</w:t>
+      </w:r>
+    </w:p>
+    <w:p>
+      <w:pPr>
+        <w:pStyle w:val="FirstParagraph"/>
+      </w:pPr>
+      <w:r>
+        <w:t xml:space="preserve">The split is defined</w:t>
+      </w:r>
+      <w:r>
+        <w:t xml:space="preserve"> </w:t>
+      </w:r>
+      <w:r>
+        <w:rPr>
+          <w:b/>
+          <w:bCs/>
+        </w:rPr>
+        <w:t xml:space="preserve">once</w:t>
+      </w:r>
+      <w:r>
+        <w:t xml:space="preserve"> </w:t>
+      </w:r>
+      <w:r>
+        <w:t xml:space="preserve">and persisted by</w:t>
+      </w:r>
+      <w:r>
+        <w:t xml:space="preserve"> </w:t>
+      </w:r>
+      <w:r>
+        <w:rPr>
+          <w:rStyle w:val="VerbatimChar"/>
+        </w:rPr>
+        <w:t xml:space="preserve">src/evaluation/make_split.py</w:t>
+      </w:r>
+      <w:r>
+        <w:t xml:space="preserve">:</w:t>
+      </w:r>
+    </w:p>
+    <w:tbl>
+      <w:tblPr>
+        <w:tblStyle w:val="Table"/>
+        <w:tblW w:type="pct" w:w="5000"/>
+        <w:tblLayout w:type="fixed"/>
+        <w:tblLook w:firstRow="1" w:lastRow="0" w:firstColumn="0" w:lastColumn="0" w:noHBand="0" w:noVBand="0" w:val="0020"/>
+      </w:tblPr>
+      <w:tblGrid>
+        <w:gridCol w:w="2640"/>
+        <w:gridCol w:w="2640"/>
+        <w:gridCol w:w="2640"/>
+      </w:tblGrid>
+      <w:tr>
+        <w:trPr>
+          <w:tblHeader w:val="on"/>
+        </w:trPr>
+        <w:tc>
+          <w:tcPr/>
+          <w:p>
+            <w:pPr>
+              <w:pStyle w:val="Compact"/>
+            </w:pPr>
+            <w:r>
+              <w:t xml:space="preserve">Artifact</w:t>
+            </w:r>
+          </w:p>
+        </w:tc>
+        <w:tc>
+          <w:tcPr/>
+          <w:p>
+            <w:pPr>
+              <w:pStyle w:val="Compact"/>
+            </w:pPr>
+            <w:r>
+              <w:t xml:space="preserve">Location</w:t>
+            </w:r>
+          </w:p>
+        </w:tc>
+        <w:tc>
+          <w:tcPr/>
+          <w:p>
+            <w:pPr>
+              <w:pStyle w:val="Compact"/>
+            </w:pPr>
+            <w:r>
+              <w:t xml:space="preserve">Committed?</w:t>
+            </w:r>
+          </w:p>
+        </w:tc>
+      </w:tr>
+      <w:tr>
+        <w:tc>
+          <w:tcPr/>
+          <w:p>
+            <w:pPr>
+              <w:pStyle w:val="Compact"/>
+            </w:pPr>
+            <w:r>
+              <w:t xml:space="preserve">Canonical test</w:t>
+            </w:r>
+            <w:r>
+              <w:t xml:space="preserve"> </w:t>
+            </w:r>
+            <w:r>
+              <w:rPr>
+                <w:rStyle w:val="VerbatimChar"/>
+              </w:rPr>
+              <w:t xml:space="preserve">id_student</w:t>
+            </w:r>
+            <w:r>
+              <w:t xml:space="preserve"> </w:t>
+            </w:r>
+            <w:r>
+              <w:t xml:space="preserve">list (5,756 students)</w:t>
+            </w:r>
+          </w:p>
+        </w:tc>
+        <w:tc>
+          <w:tcPr/>
+          <w:p>
+            <w:pPr>
+              <w:pStyle w:val="Compact"/>
+            </w:pPr>
+            <w:r>
+              <w:rPr>
+                <w:rStyle w:val="VerbatimChar"/>
+              </w:rPr>
+              <w:t xml:space="preserve">data/splits/test_student_ids.csv</w:t>
+            </w:r>
+          </w:p>
+        </w:tc>
+        <w:tc>
+          <w:tcPr/>
+          <w:p>
+            <w:pPr>
+              <w:pStyle w:val="Compact"/>
+            </w:pPr>
+            <w:r>
+              <w:t xml:space="preserve">yes</w:t>
+            </w:r>
+          </w:p>
+        </w:tc>
+      </w:tr>
+      <w:tr>
+        <w:tc>
+          <w:tcPr/>
+          <w:p>
+            <w:pPr>
+              <w:pStyle w:val="Compact"/>
+            </w:pPr>
+            <w:r>
+              <w:t xml:space="preserve">Verification report (per dataset)</w:t>
+            </w:r>
+          </w:p>
+        </w:tc>
+        <w:tc>
+          <w:tcPr/>
+          <w:p>
+            <w:pPr>
+              <w:pStyle w:val="Compact"/>
+            </w:pPr>
+            <w:r>
+              <w:rPr>
+                <w:rStyle w:val="VerbatimChar"/>
+              </w:rPr>
+              <w:t xml:space="preserve">reports/tables/split_report.csv</w:t>
+            </w:r>
+          </w:p>
+        </w:tc>
+        <w:tc>
+          <w:tcPr/>
+          <w:p>
+            <w:pPr>
+              <w:pStyle w:val="Compact"/>
+            </w:pPr>
+            <w:r>
+              <w:t xml:space="preserve">yes</w:t>
+            </w:r>
+          </w:p>
+        </w:tc>
+      </w:tr>
+      <w:tr>
+        <w:tc>
+          <w:tcPr/>
+          <w:p>
+            <w:pPr>
+              <w:pStyle w:val="Compact"/>
+            </w:pPr>
+            <w:r>
+              <w:t xml:space="preserve">Materialised train/test data (master + per checkpoint)</w:t>
+            </w:r>
+          </w:p>
+        </w:tc>
+        <w:tc>
+          <w:tcPr/>
+          <w:p>
+            <w:pPr>
+              <w:pStyle w:val="Compact"/>
+            </w:pPr>
+            <w:r>
+              <w:rPr>
+                <w:rStyle w:val="VerbatimChar"/>
+              </w:rPr>
+              <w:t xml:space="preserve">data/splits/*_train.parquet</w:t>
+            </w:r>
+            <w:r>
+              <w:t xml:space="preserve">,</w:t>
+            </w:r>
+            <w:r>
+              <w:t xml:space="preserve"> </w:t>
+            </w:r>
+            <w:r>
+              <w:rPr>
+                <w:rStyle w:val="VerbatimChar"/>
+              </w:rPr>
+              <w:t xml:space="preserve">*_test.parquet</w:t>
+            </w:r>
+          </w:p>
+        </w:tc>
+        <w:tc>
+          <w:tcPr/>
+          <w:p>
+            <w:pPr>
+              <w:pStyle w:val="Compact"/>
+            </w:pPr>
+            <w:r>
+              <w:t xml:space="preserve">git-ignored, regenerable</w:t>
+            </w:r>
+          </w:p>
+        </w:tc>
+      </w:tr>
+    </w:tbl>
+    <w:p>
+      <w:pPr>
+        <w:pStyle w:val="BodyText"/>
+      </w:pPr>
+      <w:r>
+        <w:t xml:space="preserve">The split report confirms the design across</w:t>
+      </w:r>
+      <w:r>
+        <w:t xml:space="preserve"> </w:t>
+      </w:r>
+      <w:r>
+        <w:rPr>
+          <w:rStyle w:val="VerbatimChar"/>
+        </w:rPr>
+        <w:t xml:space="preserve">master_raw</w:t>
+      </w:r>
+      <w:r>
+        <w:t xml:space="preserve"> </w:t>
+      </w:r>
+      <w:r>
+        <w:t xml:space="preserve">and</w:t>
+      </w:r>
+      <w:r>
+        <w:t xml:space="preserve"> </w:t>
+      </w:r>
+      <w:r>
+        <w:rPr>
+          <w:b/>
+          <w:bCs/>
+        </w:rPr>
+        <w:t xml:space="preserve">all six checkpoints</w:t>
+      </w:r>
+      <w:r>
+        <w:t xml:space="preserve">: train</w:t>
+      </w:r>
+      <w:r>
+        <w:t xml:space="preserve"> </w:t>
+      </w:r>
+      <w:r>
+        <w:rPr>
+          <w:b/>
+          <w:bCs/>
+        </w:rPr>
+        <w:t xml:space="preserve">26,104</w:t>
+      </w:r>
+      <w:r>
+        <w:t xml:space="preserve"> </w:t>
+      </w:r>
+      <w:r>
+        <w:t xml:space="preserve">rows · test</w:t>
+      </w:r>
+      <w:r>
+        <w:t xml:space="preserve"> </w:t>
+      </w:r>
+      <w:r>
+        <w:rPr>
+          <w:b/>
+          <w:bCs/>
+        </w:rPr>
+        <w:t xml:space="preserve">6,489</w:t>
+      </w:r>
+      <w:r>
+        <w:t xml:space="preserve"> </w:t>
+      </w:r>
+      <w:r>
+        <w:t xml:space="preserve">rows (5,756 students) · at-risk</w:t>
+      </w:r>
+      <w:r>
+        <w:t xml:space="preserve"> </w:t>
+      </w:r>
+      <w:r>
+        <w:rPr>
+          <w:b/>
+          <w:bCs/>
+        </w:rPr>
+        <w:t xml:space="preserve">0.530 / 0.520</w:t>
+      </w:r>
+      <w:r>
+        <w:t xml:space="preserve"> </w:t>
+      </w:r>
+      <w:r>
+        <w:t xml:space="preserve">·</w:t>
+      </w:r>
+      <w:r>
+        <w:t xml:space="preserve"> </w:t>
+      </w:r>
+      <w:r>
+        <w:rPr>
+          <w:b/>
+          <w:bCs/>
+        </w:rPr>
+        <w:t xml:space="preserve">0 overlap</w:t>
+      </w:r>
+      <w:r>
+        <w:t xml:space="preserve"> </w:t>
+      </w:r>
+      <w:r>
+        <w:t xml:space="preserve">— identical at every checkpoint. The modelling phase loads a checkpoint’s split with one call:</w:t>
+      </w:r>
+    </w:p>
+    <w:p>
+      <w:pPr>
+        <w:pStyle w:val="SourceCode"/>
+      </w:pPr>
+      <w:r>
+        <w:rPr>
+          <w:rStyle w:val="VerbatimChar"/>
+        </w:rPr>
+        <w:t xml:space="preserve">from src.evaluation.make_split import load_checkpoint_split</w:t>
+      </w:r>
+      <w:r>
+        <w:br/>
+      </w:r>
+      <w:r>
+        <w:rPr>
+          <w:rStyle w:val="VerbatimChar"/>
+        </w:rPr>
+        <w:t xml:space="preserve">X_train, X_test = load_checkpoint_split(40)   # train/test at the 40% checkpoint</w:t>
+      </w:r>
+    </w:p>
+    <w:bookmarkEnd w:id="14"/>
+    <w:bookmarkStart w:id="15" w:name="references"/>
     <w:p>
       <w:pPr>
         <w:pStyle w:val="Heading2"/>
@@ -837,8 +1195,8 @@
         <w:t xml:space="preserve">, vol. 143, art. 103676, 2020.</w:t>
       </w:r>
     </w:p>
-    <w:bookmarkEnd w:id="14"/>
     <w:bookmarkEnd w:id="15"/>
+    <w:bookmarkEnd w:id="16"/>
     <w:sectPr>
       <w:footnotePr>
         <w:numRestart w:val="eachSect"/>

</xml_diff>